<commit_message>
Corrige créditos y horas de trabajo con la malla curricular 2026 corregida
Actualiza el punto 8 y, por coherencia, los puntos 4.3.5 y 4.4 con la
asignación de créditos por asignatura de la malla corregida (60 créditos
por año, Resolución HCU 351/2021) y ajusta el informe 4.5.

Co-Authored-By: Claude Opus 5.5 <noreply@anthropic.com>
Claude-Session: https://claude.ai/code/session_01Li7yxA95TVg4oPXuqG5DZe
</commit_message>
<xml_diff>
--- a/rediseno_2026/4.3 Plan de estudios propuesto.docx
+++ b/rediseno_2026/4.3 Plan de estudios propuesto.docx
@@ -3309,7 +3309,7 @@
           <w:i w:val="0"/>
           <w:sz w:val="16"/>
         </w:rPr>
-        <w:t>Fuente: Reglamento del Sistema de Asignación de Créditos Académicos de la UMSA.</w:t>
+        <w:t>Fuente: Reglamento del Sistema de Asignación de Créditos Académicos de la UMSA y Resolución HCU N.º 351/2021.</w:t>
       </w:r>
     </w:p>
     <w:p>
@@ -3339,7 +3339,7 @@
           <w:i w:val="0"/>
           <w:sz w:val="20"/>
         </w:rPr>
-        <w:t>Los créditos de cada asignatura resultan de dividir su carga horaria total entre 30, con mayor asignación a las asignaturas troncales según su complejidad. Las 6.000 horas académicas del plan, de 45 minutos, equivalen a 4.500 horas reloj presenciales; si se reconoce una hora de trabajo autónomo por cada hora reloj presencial, la carga total llega a 9.000 horas de trabajo y a 300 créditos, equivalentes a 300 créditos del Crédito Latinoamericano de Referencia, lo que favorece la homologación y la movilidad estudiantil. La asignación de créditos por asignatura y por año se presenta en los puntos 4.4.3 y 4.4.4.</w:t>
+        <w:t>Conforme a la Resolución HCU N.º 351/2021, se asignan 60 créditos por año académico y un crédito equivale a 30 horas de trabajo del estudiante, presenciales y no presenciales. Las 6.000 horas académicas presenciales del plan se complementan con 3.000 horas de trabajo no presencial, lo que da 9.000 horas de trabajo y 300 créditos, equivalentes a 300 créditos del Crédito Latinoamericano de Referencia, lo que favorece la homologación y la movilidad estudiantil. Los créditos de cada asignatura se asignan según el trabajo presencial y no presencial que exige, con mayor asignación a las asignaturas troncales de mayor complejidad. La asignación por asignatura y por año se presenta en los puntos 4.4.3 y 4.4.4.</w:t>
       </w:r>
     </w:p>
     <w:sectPr>

</xml_diff>